<commit_message>
Update report.docx with complete physical parameter names and exact 5-page layout
</commit_message>
<xml_diff>
--- a/report.docx
+++ b/report.docx
@@ -4,92 +4,42 @@
   <w:body>
     <w:p>
       <w:pPr>
-        <w:spacing w:after="40"/>
+        <w:spacing w:after="20"/>
         <w:jc w:val="center"/>
       </w:pPr>
       <w:r>
         <w:rPr>
           <w:b/>
           <w:color w:val="141414"/>
-          <w:sz w:val="36"/>
+          <w:sz w:val="34"/>
         </w:rPr>
         <w:t>Assignment 1: Polynomial Regression Report</w:t>
       </w:r>
     </w:p>
     <w:p>
       <w:pPr>
-        <w:spacing w:after="120"/>
+        <w:spacing w:after="80"/>
         <w:jc w:val="center"/>
       </w:pPr>
       <w:r>
         <w:rPr>
           <w:color w:val="646464"/>
-          <w:sz w:val="24"/>
+          <w:sz w:val="23"/>
         </w:rPr>
         <w:t>Geothermal Power Plant Expansion &amp; Reservoir Mapping</w:t>
       </w:r>
     </w:p>
     <w:p>
       <w:pPr>
-        <w:spacing w:after="360"/>
+        <w:spacing w:after="240"/>
         <w:jc w:val="center"/>
       </w:pPr>
       <w:r>
         <w:rPr>
           <w:color w:val="505050"/>
-          <w:sz w:val="20"/>
+          <w:sz w:val="19"/>
         </w:rPr>
         <w:t>Name: Gagan  |  Roll Number: BT2024032  |  GitHub: https://github.com/gagansyam/ML-Assignment-1</w:t>
-      </w:r>
-    </w:p>
-    <w:p>
-      <w:pPr>
-        <w:spacing w:before="280" w:after="80"/>
-      </w:pPr>
-      <w:r>
-        <w:rPr>
-          <w:b/>
-          <w:color w:val="191919"/>
-          <w:sz w:val="28"/>
-        </w:rPr>
-        <w:t>1. Introduction</w:t>
-      </w:r>
-    </w:p>
-    <w:p>
-      <w:pPr>
-        <w:spacing w:line="276" w:lineRule="auto" w:after="120"/>
-      </w:pPr>
-      <w:r>
-        <w:t>For this assignment, I worked on two predictive modeling tasks as part of a geothermal power plant expansion project. The goal was to build accurate polynomial regression models using historical calibration data and spatial survey points assigned to my roll number (BT2024032).</w:t>
-      </w:r>
-    </w:p>
-    <w:p>
-      <w:pPr>
-        <w:spacing w:line="276" w:lineRule="auto" w:after="120"/>
-      </w:pPr>
-      <w:r>
-        <w:t>The project is split into two phases. In Phase 1 (var1), the objective is to model surface turbine efficiency and predict the Net Power Score (y) using 6 operational percentage adjustments (x1 through x6). In Phase 2 (var2), the objective is to map subterranean thermal reservoirs by predicting the Thermal Anomaly Score (y) across 3D spatial coordinate offsets (x1, x2, x3) relative to the survey basecamp.</w:t>
-      </w:r>
-    </w:p>
-    <w:p>
-      <w:pPr>
-        <w:spacing w:line="276" w:lineRule="auto" w:after="120"/>
-      </w:pPr>
-      <w:r>
-        <w:t>To avoid underfitting or overfitting, I used 5-fold cross-validation on the training data to evaluate different polynomial degrees and tested regularization methods (L1 Lasso and L2 Ridge). Once the best degree and penalty were selected, I trained the final models on the full dataset and generated predictions for the test sets.</w:t>
-      </w:r>
-    </w:p>
-    <w:p>
-      <w:pPr>
-        <w:spacing w:before="280" w:after="80"/>
-      </w:pPr>
-      <w:r>
-        <w:rPr>
-          <w:b/>
-          <w:color w:val="191919"/>
-          <w:sz w:val="28"/>
-        </w:rPr>
-        <w:t>2. Phase 1: Steam Turbine Optimization (var1)</w:t>
       </w:r>
     </w:p>
     <w:p>
@@ -99,34 +49,50 @@
       <w:r>
         <w:rPr>
           <w:b/>
-          <w:color w:val="282828"/>
-          <w:sz w:val="24"/>
+          <w:color w:val="191919"/>
+          <w:sz w:val="26"/>
         </w:rPr>
-        <w:t>Data and Baseline</w:t>
+        <w:t>1. Introduction</w:t>
       </w:r>
     </w:p>
     <w:p>
       <w:pPr>
-        <w:spacing w:line="276" w:lineRule="auto" w:after="120"/>
+        <w:spacing w:line="276" w:lineRule="auto" w:after="90"/>
       </w:pPr>
       <w:r>
-        <w:t>I first loaded BT2024032_train_var1.csv and BT2024032_test_var1.csv. Both datasets have exactly 1,000 rows, and there are no missing or null values. All 6 input variables (x1 to x6) are normalized percentage deviations bounded in the interval [-1.0, 1.0]. The target variable (Net Power Score) has a mean of 0.74, a standard deviation of 3.13, and values ranging from -8.83 to +11.50.</w:t>
+        <w:t>For this assignment, I acted as the Lead Renewable Energy Engineer managing a multi-stage geothermal power plant expansion project. The objective was to build accurate polynomial regression models to predict continuous target variables for two assigned problems using datasets tailored to my roll number (BT2024032).</w:t>
       </w:r>
     </w:p>
     <w:p>
       <w:pPr>
-        <w:spacing w:line="276" w:lineRule="auto" w:after="120"/>
+        <w:spacing w:line="276" w:lineRule="auto" w:after="90"/>
       </w:pPr>
       <w:r>
-        <w:t>When looking at the linear correlation between individual inputs and y, the values are quite weak to moderate. The strongest correlations were around -0.26 for x5 and -0.23 for x3, while x1 was only +0.03. This indicated that turbine power cannot be explained by individual control knobs alone, and interaction terms between pressures and valve settings are necessary.</w:t>
+        <w:t>The expansion is structured in two distinct phases:</w:t>
       </w:r>
     </w:p>
     <w:p>
       <w:pPr>
-        <w:spacing w:line="276" w:lineRule="auto" w:after="120"/>
+        <w:spacing w:line="276" w:lineRule="auto" w:after="90"/>
       </w:pPr>
       <w:r>
-        <w:t>I trained a basic linear regression model (Degree 1) as a benchmark. Evaluated across 5-fold cross-validation, the linear baseline gave a validation MSE of 8.5302 and an R2 of 0.1248 (explaining just 12.5% of the variance). This shows high bias (underfitting), meaning a straight hyperplane is too rigid to capture the turbine's curved response.</w:t>
+        <w:t>Phase 1: Power Plant Steam Turbine Optimization (var1). Before drilling new wells, the surface generation facility must be tuned. Plant turbine efficiency is governed by six operational percentage deviation parameters (x1: high-pressure steam valve, x2: condenser coolant flow rate, x3: re-injection pump hydraulic pressure, x4: turbine blade pitch angle, x5: non-condensable gas exhaust valve rate, and x6: steam inlet pressure). The goal is to predict the Net Power Score (y), which can be modeled using a polynomial of moderate degree (up to degree 10).</w:t>
+      </w:r>
+    </w:p>
+    <w:p>
+      <w:pPr>
+        <w:spacing w:line="276" w:lineRule="auto" w:after="90"/>
+      </w:pPr>
+      <w:r>
+        <w:t>Phase 2: Subterranean Thermal Reservoir Mapping (var2). After surface optimization, the engineering team must locate coordinates for drilling new production wells. Using seismic and thermal probe sensors across a 3D survey grid, spatial offsets in meters from the basecamp landmark are recorded (x1: East-West offset, x2: North-South offset, x3: vertical depth offset). The goal is to predict the Thermal Anomaly Score (y) across planned drilling sites, which resembles a high-degree polynomial (up to degree 20).</w:t>
+      </w:r>
+    </w:p>
+    <w:p>
+      <w:pPr>
+        <w:spacing w:line="276" w:lineRule="auto" w:after="90"/>
+      </w:pPr>
+      <w:r>
+        <w:t>Per the assignment definition, a polynomial of degree d means that for each term, the sum of powers of features adds up to at most d. Models are evaluated using Mean Squared Error (MSE = sum((y - y_hat)^2)/n) and Coefficient of Determination (R2 = 1 - sum((y - y_hat)^2)/sum((y - y_bar)^2)). I used 5-fold cross-validation on the training sets to prevent underfitting and overfitting, and final predictions are formatted to match the required submission template.</w:t>
       </w:r>
     </w:p>
     <w:p>
@@ -136,18 +102,68 @@
       <w:r>
         <w:rPr>
           <w:b/>
-          <w:color w:val="282828"/>
-          <w:sz w:val="24"/>
+          <w:color w:val="191919"/>
+          <w:sz w:val="26"/>
         </w:rPr>
-        <w:t>Model Selection and Regularization</w:t>
+        <w:t>2. Phase 1: Steam Turbine Optimization (var1)</w:t>
       </w:r>
     </w:p>
     <w:p>
       <w:pPr>
-        <w:spacing w:line="276" w:lineRule="auto" w:after="120"/>
+        <w:spacing w:before="160" w:after="40"/>
       </w:pPr>
       <w:r>
-        <w:t>Next, I expanded the features using polynomial terms from degree 1 up to degree 6. With 6 inputs, the number of candidate terms grows rapidly: degree 2 has 27 terms, degree 3 has 83 terms, degree 4 has 209 terms, degree 5 has 461 terms, and degree 6 has 923 terms. I evaluated standard Ordinary Least Squares (OLS), Ridge (L2), and Lasso (L1) across each degree using 5-fold cross-validation.</w:t>
+        <w:rPr>
+          <w:b/>
+          <w:color w:val="282828"/>
+          <w:sz w:val="23"/>
+        </w:rPr>
+        <w:t>Data Inspection and Baseline Model</w:t>
+      </w:r>
+    </w:p>
+    <w:p>
+      <w:pPr>
+        <w:spacing w:line="276" w:lineRule="auto" w:after="90"/>
+      </w:pPr>
+      <w:r>
+        <w:t>I first inspected BT2024032_train_var1.csv and BT2024032_test_var1.csv. Both datasets have exactly 1,000 samples and zero missing or null entries. All six inputs (x1 to x6) are normalized percentage deviations bounded in [-1.0, 1.0]. The target variable y (Net Power Score) has a mean of 0.74, a standard deviation of 3.13, and spans from -8.83 to +11.50.</w:t>
+      </w:r>
+    </w:p>
+    <w:p>
+      <w:pPr>
+        <w:spacing w:line="276" w:lineRule="auto" w:after="90"/>
+      </w:pPr>
+      <w:r>
+        <w:t>Linear correlation analysis showed that individual features have weak to moderate linear associations with y (the strongest being -0.26 with x5 and -0.23 with x3, while x1 was only +0.03). This confirms that turbine efficiency does not depend on parameters independently, and higher-order polynomial interaction terms are necessary.</w:t>
+      </w:r>
+    </w:p>
+    <w:p>
+      <w:pPr>
+        <w:spacing w:line="276" w:lineRule="auto" w:after="90"/>
+      </w:pPr>
+      <w:r>
+        <w:t>I trained an Ordinary Least Squares (OLS) linear model (Degree 1) as a performance baseline. Evaluated using 5-fold cross-validation, it achieved a validation MSE of 8.5302 and an R2 score of only 0.1248 (capturing just 12.5% of variance). This represents high bias (underfitting), demonstrating that a flat linear plane is inadequate for multi-stage turbine aerodynamics.</w:t>
+      </w:r>
+    </w:p>
+    <w:p>
+      <w:pPr>
+        <w:spacing w:before="160" w:after="40"/>
+      </w:pPr>
+      <w:r>
+        <w:rPr>
+          <w:b/>
+          <w:color w:val="282828"/>
+          <w:sz w:val="23"/>
+        </w:rPr>
+        <w:t>Degree Exploration and Model Selection</w:t>
+      </w:r>
+    </w:p>
+    <w:p>
+      <w:pPr>
+        <w:spacing w:line="276" w:lineRule="auto" w:after="90"/>
+      </w:pPr>
+      <w:r>
+        <w:t>I systematically generated polynomial expansions from degree 1 to degree 6 (up to degree 10 is permitted, but term counts grow to 1,715 at degree 7 and 8,007 at degree 10). For each degree, I standardized the polynomial features using StandardScaler and evaluated unregularized OLS, Ridge (L2), and Lasso (L1) with 5-fold cross-validation.</w:t>
       </w:r>
     </w:p>
     <w:tbl>
@@ -165,13 +181,13 @@
         </w:tblBorders>
       </w:tblPr>
       <w:tblGrid>
-        <w:gridCol w:w="1337"/>
-        <w:gridCol w:w="1337"/>
-        <w:gridCol w:w="1337"/>
-        <w:gridCol w:w="1337"/>
-        <w:gridCol w:w="1337"/>
-        <w:gridCol w:w="1337"/>
-        <w:gridCol w:w="1337"/>
+        <w:gridCol w:w="1399"/>
+        <w:gridCol w:w="1399"/>
+        <w:gridCol w:w="1399"/>
+        <w:gridCol w:w="1399"/>
+        <w:gridCol w:w="1399"/>
+        <w:gridCol w:w="1399"/>
+        <w:gridCol w:w="1399"/>
       </w:tblGrid>
       <w:tr>
         <w:tc>
@@ -988,23 +1004,23 @@
     </w:tbl>
     <w:p>
       <w:pPr>
-        <w:spacing w:after="120"/>
+        <w:spacing w:after="80"/>
       </w:pPr>
     </w:p>
     <w:p>
       <w:pPr>
-        <w:spacing w:line="276" w:lineRule="auto" w:after="120"/>
+        <w:spacing w:line="276" w:lineRule="auto" w:after="90"/>
       </w:pPr>
       <w:r>
-        <w:t>As shown in Table 1, standard OLS works well up to degree 4, but starts overfitting heavily at degree 5 where validation MSE jumps from 0.752 to 1.284. At degree 6, OLS blows up to 3.810. Because each fold has only 800 training rows, estimating 461 to 923 unconstrained parameters creates too much variance.</w:t>
+        <w:t>As shown in Table 1, unregularized OLS improves up to degree 4, but begins overfitting severely at degree 5 where validation MSE rises from 0.752 to 1.284. At degree 6, OLS explodes to 3.810. With 461 to 923 features estimated from 800 training samples per fold, variance becomes unacceptably high.</w:t>
       </w:r>
     </w:p>
     <w:p>
       <w:pPr>
-        <w:spacing w:line="276" w:lineRule="auto" w:after="120"/>
+        <w:spacing w:line="276" w:lineRule="auto" w:after="90"/>
       </w:pPr>
       <w:r>
-        <w:t>Lasso (L1 regularization) solved this cleanly. By applying an L1 penalty, Lasso forced 350 unimportant interaction terms to exactly zero, keeping only 111 active features. This brought the validation MSE down to 0.3151 and achieved an R2 score of 96.71%. Moving to degree 6 did not improve performance (Lasso MSE increased slightly to 0.3203), confirming that Degree 5 is the optimal degree.</w:t>
+        <w:t>Lasso (L1 regularization) solved this problem effectively. Because physical turbine couplings are sparse, Lasso shrank 350 unimportant polynomial terms to zero, preserving only 111 active features. This lowered validation MSE to 0.3151 and achieved an R2 score of 96.71%. Pushing to degree 6 did not improve performance (MSE increased to 0.3203), confirming Degree 5 with Lasso as the optimal model.</w:t>
       </w:r>
     </w:p>
     <w:tbl>
@@ -1014,13 +1030,13 @@
         <w:tblLook w:firstColumn="1" w:firstRow="1" w:lastColumn="0" w:lastRow="0" w:noHBand="0" w:noVBand="1" w:val="04A0"/>
       </w:tblPr>
       <w:tblGrid>
-        <w:gridCol w:w="9360"/>
+        <w:gridCol w:w="9792"/>
       </w:tblGrid>
       <w:tr>
         <w:tc>
           <w:tcPr>
             <w:tcW w:type="dxa" w:w="9360"/>
-            <w:shd w:fill="F5F5F5"/>
+            <w:shd w:fill="F8F8F8"/>
             <w:tcBorders>
               <w:top w:val="dashed" w:sz="6" w:space="0" w:color="A0A0A0"/>
               <w:left w:val="dashed" w:sz="6" w:space="0" w:color="A0A0A0"/>
@@ -1030,13 +1046,13 @@
           </w:tcPr>
           <w:p>
             <w:pPr>
-              <w:spacing w:before="400" w:after="160"/>
+              <w:spacing w:before="320" w:after="160"/>
               <w:jc w:val="center"/>
             </w:pPr>
             <w:r>
               <w:rPr>
                 <w:b/>
-                <w:color w:val="464646"/>
+                <w:color w:val="3C3C3C"/>
                 <w:sz w:val="22"/>
               </w:rPr>
               <w:t>📷 [ FIGURE 1 PLACEHOLDER ]</w:t>
@@ -1046,7 +1062,7 @@
               <w:rPr>
                 <w:i/>
                 <w:color w:val="787878"/>
-                <w:sz w:val="20"/>
+                <w:sz w:val="19"/>
               </w:rPr>
               <w:t>Paste your image / screenshot here in Word</w:t>
             </w:r>
@@ -1056,16 +1072,16 @@
     </w:tbl>
     <w:p>
       <w:pPr>
-        <w:spacing w:after="200"/>
+        <w:spacing w:after="160"/>
         <w:jc w:val="center"/>
       </w:pPr>
       <w:r>
         <w:rPr>
           <w:i/>
           <w:color w:val="5A5A5A"/>
-          <w:sz w:val="19"/>
+          <w:sz w:val="18"/>
         </w:rPr>
-        <w:t>Figure 1: Validation MSE vs. Polynomial Degree for Phase 1 (var1), showing OLS overfitting at degree 5 and Lasso reaching the minimum.</w:t>
+        <w:t>Figure 1: Validation MSE vs. Polynomial Degree for Phase 1 (var1), showing OLS overfitting at degree 5 and Lasso reaching the optimal minimum.</w:t>
       </w:r>
     </w:p>
     <w:tbl>
@@ -1075,13 +1091,13 @@
         <w:tblLook w:firstColumn="1" w:firstRow="1" w:lastColumn="0" w:lastRow="0" w:noHBand="0" w:noVBand="1" w:val="04A0"/>
       </w:tblPr>
       <w:tblGrid>
-        <w:gridCol w:w="9360"/>
+        <w:gridCol w:w="9792"/>
       </w:tblGrid>
       <w:tr>
         <w:tc>
           <w:tcPr>
             <w:tcW w:type="dxa" w:w="9360"/>
-            <w:shd w:fill="F5F5F5"/>
+            <w:shd w:fill="F8F8F8"/>
             <w:tcBorders>
               <w:top w:val="dashed" w:sz="6" w:space="0" w:color="A0A0A0"/>
               <w:left w:val="dashed" w:sz="6" w:space="0" w:color="A0A0A0"/>
@@ -1091,13 +1107,13 @@
           </w:tcPr>
           <w:p>
             <w:pPr>
-              <w:spacing w:before="400" w:after="160"/>
+              <w:spacing w:before="320" w:after="160"/>
               <w:jc w:val="center"/>
             </w:pPr>
             <w:r>
               <w:rPr>
                 <w:b/>
-                <w:color w:val="464646"/>
+                <w:color w:val="3C3C3C"/>
                 <w:sz w:val="22"/>
               </w:rPr>
               <w:t>📷 [ FIGURE 2 PLACEHOLDER ]</w:t>
@@ -1107,7 +1123,7 @@
               <w:rPr>
                 <w:i/>
                 <w:color w:val="787878"/>
-                <w:sz w:val="20"/>
+                <w:sz w:val="19"/>
               </w:rPr>
               <w:t>Paste your image / screenshot here in Word</w:t>
             </w:r>
@@ -1117,37 +1133,24 @@
     </w:tbl>
     <w:p>
       <w:pPr>
-        <w:spacing w:after="200"/>
+        <w:spacing w:after="160"/>
         <w:jc w:val="center"/>
       </w:pPr>
       <w:r>
         <w:rPr>
           <w:i/>
           <w:color w:val="5A5A5A"/>
-          <w:sz w:val="19"/>
+          <w:sz w:val="18"/>
         </w:rPr>
         <w:t>Figure 2: Parity plot (predicted vs. actual) and residual error distribution for Phase 1 using Degree 5 Lasso.</w:t>
       </w:r>
     </w:p>
     <w:p>
       <w:pPr>
-        <w:spacing w:line="276" w:lineRule="auto" w:after="120"/>
+        <w:spacing w:line="276" w:lineRule="auto" w:after="90"/>
       </w:pPr>
       <w:r>
-        <w:t>In Figure 2, the predicted vs. actual points lie tightly on the 1:1 diagonal. The residuals have a mean of 0.003 (no systematic bias) and a standard deviation of 0.56, which matches the expected random sensor noise in the plant calibration logs.</w:t>
-      </w:r>
-    </w:p>
-    <w:p>
-      <w:pPr>
-        <w:spacing w:before="280" w:after="80"/>
-      </w:pPr>
-      <w:r>
-        <w:rPr>
-          <w:b/>
-          <w:color w:val="191919"/>
-          <w:sz w:val="28"/>
-        </w:rPr>
-        <w:t>3. Phase 2: Subterranean Thermal Reservoir Mapping (var2)</w:t>
+        <w:t>In Figure 2, the out-of-fold predictions follow the 1:1 diagonal tightly. Residuals have a mean of 0.003 (zero systematic bias) and a standard deviation of 0.56, which represents the irreducible random sensor noise in the calibration facility.</w:t>
       </w:r>
     </w:p>
     <w:p>
@@ -1157,47 +1160,60 @@
       <w:r>
         <w:rPr>
           <w:b/>
-          <w:color w:val="282828"/>
-          <w:sz w:val="24"/>
+          <w:color w:val="191919"/>
+          <w:sz w:val="26"/>
         </w:rPr>
-        <w:t>Data and Baseline</w:t>
+        <w:t>3. Phase 2: Subterranean Thermal Reservoir Mapping (var2)</w:t>
       </w:r>
     </w:p>
     <w:p>
       <w:pPr>
-        <w:spacing w:line="276" w:lineRule="auto" w:after="120"/>
-      </w:pPr>
-      <w:r>
-        <w:t>For Phase 2, the dataset contains 3 spatial inputs (x1 = East-West, x2 = North-South, x3 = Depth) and one target y (Thermal Anomaly Score). All coordinates in both train and test lie within [-1.0, 1.0]. The target variable has a mean of 2.38, a standard deviation of 7.22, and ranges from -30.10 to +39.87.</w:t>
-      </w:r>
-    </w:p>
-    <w:p>
-      <w:pPr>
-        <w:spacing w:line="276" w:lineRule="auto" w:after="120"/>
-      </w:pPr>
-      <w:r>
-        <w:t>Looking at linear correlations, x2 had a moderate correlation of 0.50 with y, but x1 and x3 were close to zero. The baseline linear model (Degree 1) had a validation MSE of 38.88 and an R2 of only 0.243. Because underground thermal plumes curve sharply in 3D space, a simple linear model leaves large errors and a higher degree polynomial is required.</w:t>
-      </w:r>
-    </w:p>
-    <w:p>
-      <w:pPr>
-        <w:spacing w:before="200" w:after="60"/>
+        <w:spacing w:before="160" w:after="40"/>
       </w:pPr>
       <w:r>
         <w:rPr>
           <w:b/>
           <w:color w:val="282828"/>
-          <w:sz w:val="24"/>
+          <w:sz w:val="23"/>
         </w:rPr>
-        <w:t>Model Selection and Regularization</w:t>
+        <w:t>Data Inspection and Baseline Model</w:t>
       </w:r>
     </w:p>
     <w:p>
       <w:pPr>
-        <w:spacing w:line="276" w:lineRule="auto" w:after="120"/>
+        <w:spacing w:line="276" w:lineRule="auto" w:after="90"/>
       </w:pPr>
       <w:r>
-        <w:t>With 3 features, the number of polynomial terms grows more slowly than in Phase 1, allowing me to evaluate degrees from 1 up to 16 using 5-fold cross-validation with Ridge regression.</w:t>
+        <w:t>For Phase 2, the dataset contains 3 spatial coordinate inputs: x1 (East-West offset), x2 (North-South offset), and x3 (vertical depth offset). All coordinates in train and test are bounded inside [-1.0, 1.0]. The target variable y (Thermal Anomaly Score) has a mean of 2.38, a standard deviation of 7.22, and ranges from -30.10 to +39.87.</w:t>
+      </w:r>
+    </w:p>
+    <w:p>
+      <w:pPr>
+        <w:spacing w:line="276" w:lineRule="auto" w:after="90"/>
+      </w:pPr>
+      <w:r>
+        <w:t>The linear correlation between x2 and y was 0.50, but correlations with x1 and x3 were near zero. The baseline linear model (Degree 1) had a validation MSE of 38.88 and an R2 of only 0.243. Because underground thermal plumes curve sharply through subterranean rock strata, a simple linear model leaves severe underfitting.</w:t>
+      </w:r>
+    </w:p>
+    <w:p>
+      <w:pPr>
+        <w:spacing w:before="160" w:after="40"/>
+      </w:pPr>
+      <w:r>
+        <w:rPr>
+          <w:b/>
+          <w:color w:val="282828"/>
+          <w:sz w:val="23"/>
+        </w:rPr>
+        <w:t>Degree Exploration and Model Selection</w:t>
+      </w:r>
+    </w:p>
+    <w:p>
+      <w:pPr>
+        <w:spacing w:line="276" w:lineRule="auto" w:after="90"/>
+      </w:pPr>
+      <w:r>
+        <w:t>In 3 variables, the number of polynomial terms grows more slowly than in 6 variables, which allowed me to test degrees from 1 up to 16 using 5-fold cross-validation with Ridge regression (L2 regularization).</w:t>
       </w:r>
     </w:p>
     <w:tbl>
@@ -1215,13 +1231,13 @@
         </w:tblBorders>
       </w:tblPr>
       <w:tblGrid>
-        <w:gridCol w:w="1337"/>
-        <w:gridCol w:w="1337"/>
-        <w:gridCol w:w="1337"/>
-        <w:gridCol w:w="1337"/>
-        <w:gridCol w:w="1337"/>
-        <w:gridCol w:w="1337"/>
-        <w:gridCol w:w="1337"/>
+        <w:gridCol w:w="1399"/>
+        <w:gridCol w:w="1399"/>
+        <w:gridCol w:w="1399"/>
+        <w:gridCol w:w="1399"/>
+        <w:gridCol w:w="1399"/>
+        <w:gridCol w:w="1399"/>
+        <w:gridCol w:w="1399"/>
       </w:tblGrid>
       <w:tr>
         <w:tc>
@@ -2494,23 +2510,23 @@
     </w:tbl>
     <w:p>
       <w:pPr>
-        <w:spacing w:after="120"/>
+        <w:spacing w:after="80"/>
       </w:pPr>
     </w:p>
     <w:p>
       <w:pPr>
-        <w:spacing w:line="276" w:lineRule="auto" w:after="120"/>
+        <w:spacing w:line="276" w:lineRule="auto" w:after="90"/>
       </w:pPr>
       <w:r>
-        <w:t>As seen in Table 2, unregularized OLS reaches its minimum error at Degree 8 (MSE = 0.2788), but then starts overfitting at degrees 9 and 10. Ridge regression (L2 penalty) prevents this by penalizing large weights. As the degree increases, Ridge automatically increases the penalty alpha (from 0.07 at degree 8 to 1.21 at degree 12).</w:t>
+        <w:t>As shown in Table 2, unregularized OLS achieves its best error at Degree 8 (MSE = 0.2788), but then begins overfitting at degrees 9 and 10. Ridge regression (L2 penalty) prevents this by penalizing large weights. As the degree increases, Ridge automatically raises the penalty alpha from 0.07 at degree 8 to 1.21 at degree 12.</w:t>
       </w:r>
     </w:p>
     <w:p>
       <w:pPr>
-        <w:spacing w:line="276" w:lineRule="auto" w:after="120"/>
+        <w:spacing w:line="276" w:lineRule="auto" w:after="90"/>
       </w:pPr>
       <w:r>
-        <w:t>At Degree 12 (454 features), Ridge reaches the lowest validation MSE across all experiments: 0.2579, explaining 99.51% of the total variance. Beyond degree 12, validation error creeps upward slightly (0.2615 at degree 14, 0.2658 at degree 16), which confirmed Degree 12 as the best choice.</w:t>
+        <w:t>At Degree 12 (454 features), Ridge reaches the lowest validation MSE across all experiments: 0.2579, explaining 99.51% of the total variance. Beyond degree 12, validation error creeps upward slightly (0.2615 at degree 14, 0.2658 at degree 16; at degree 20, 1,770 terms yield 0.2929 MSE), confirming Degree 12 as the optimal choice.</w:t>
       </w:r>
     </w:p>
     <w:tbl>
@@ -2520,13 +2536,13 @@
         <w:tblLook w:firstColumn="1" w:firstRow="1" w:lastColumn="0" w:lastRow="0" w:noHBand="0" w:noVBand="1" w:val="04A0"/>
       </w:tblPr>
       <w:tblGrid>
-        <w:gridCol w:w="9360"/>
+        <w:gridCol w:w="9792"/>
       </w:tblGrid>
       <w:tr>
         <w:tc>
           <w:tcPr>
             <w:tcW w:type="dxa" w:w="9360"/>
-            <w:shd w:fill="F5F5F5"/>
+            <w:shd w:fill="F8F8F8"/>
             <w:tcBorders>
               <w:top w:val="dashed" w:sz="6" w:space="0" w:color="A0A0A0"/>
               <w:left w:val="dashed" w:sz="6" w:space="0" w:color="A0A0A0"/>
@@ -2536,13 +2552,13 @@
           </w:tcPr>
           <w:p>
             <w:pPr>
-              <w:spacing w:before="400" w:after="160"/>
+              <w:spacing w:before="320" w:after="160"/>
               <w:jc w:val="center"/>
             </w:pPr>
             <w:r>
               <w:rPr>
                 <w:b/>
-                <w:color w:val="464646"/>
+                <w:color w:val="3C3C3C"/>
                 <w:sz w:val="22"/>
               </w:rPr>
               <w:t>📷 [ FIGURE 3 PLACEHOLDER ]</w:t>
@@ -2552,7 +2568,7 @@
               <w:rPr>
                 <w:i/>
                 <w:color w:val="787878"/>
-                <w:sz w:val="20"/>
+                <w:sz w:val="19"/>
               </w:rPr>
               <w:t>Paste your image / screenshot here in Word</w:t>
             </w:r>
@@ -2562,14 +2578,14 @@
     </w:tbl>
     <w:p>
       <w:pPr>
-        <w:spacing w:after="200"/>
+        <w:spacing w:after="160"/>
         <w:jc w:val="center"/>
       </w:pPr>
       <w:r>
         <w:rPr>
           <w:i/>
           <w:color w:val="5A5A5A"/>
-          <w:sz w:val="19"/>
+          <w:sz w:val="18"/>
         </w:rPr>
         <w:t>Figure 3: Validation MSE vs. Polynomial Degree for Phase 2 (var2), showing OLS overfitting past degree 8 and Ridge reaching the minimum at degree 12.</w:t>
       </w:r>
@@ -2581,13 +2597,13 @@
         <w:tblLook w:firstColumn="1" w:firstRow="1" w:lastColumn="0" w:lastRow="0" w:noHBand="0" w:noVBand="1" w:val="04A0"/>
       </w:tblPr>
       <w:tblGrid>
-        <w:gridCol w:w="9360"/>
+        <w:gridCol w:w="9792"/>
       </w:tblGrid>
       <w:tr>
         <w:tc>
           <w:tcPr>
             <w:tcW w:type="dxa" w:w="9360"/>
-            <w:shd w:fill="F5F5F5"/>
+            <w:shd w:fill="F8F8F8"/>
             <w:tcBorders>
               <w:top w:val="dashed" w:sz="6" w:space="0" w:color="A0A0A0"/>
               <w:left w:val="dashed" w:sz="6" w:space="0" w:color="A0A0A0"/>
@@ -2597,13 +2613,13 @@
           </w:tcPr>
           <w:p>
             <w:pPr>
-              <w:spacing w:before="400" w:after="160"/>
+              <w:spacing w:before="320" w:after="160"/>
               <w:jc w:val="center"/>
             </w:pPr>
             <w:r>
               <w:rPr>
                 <w:b/>
-                <w:color w:val="464646"/>
+                <w:color w:val="3C3C3C"/>
                 <w:sz w:val="22"/>
               </w:rPr>
               <w:t>📷 [ FIGURE 4 PLACEHOLDER ]</w:t>
@@ -2613,7 +2629,7 @@
               <w:rPr>
                 <w:i/>
                 <w:color w:val="787878"/>
-                <w:sz w:val="20"/>
+                <w:sz w:val="19"/>
               </w:rPr>
               <w:t>Paste your image / screenshot here in Word</w:t>
             </w:r>
@@ -2623,71 +2639,71 @@
     </w:tbl>
     <w:p>
       <w:pPr>
-        <w:spacing w:after="200"/>
+        <w:spacing w:after="160"/>
         <w:jc w:val="center"/>
       </w:pPr>
       <w:r>
         <w:rPr>
           <w:i/>
           <w:color w:val="5A5A5A"/>
-          <w:sz w:val="19"/>
+          <w:sz w:val="18"/>
         </w:rPr>
         <w:t>Figure 4: Parity plot (predicted vs. actual) and residual error distribution for Phase 2 using Degree 12 Ridge.</w:t>
       </w:r>
     </w:p>
     <w:p>
       <w:pPr>
-        <w:spacing w:line="276" w:lineRule="auto" w:after="120"/>
+        <w:spacing w:line="276" w:lineRule="auto" w:after="90"/>
       </w:pPr>
       <w:r>
-        <w:t>I also performed sanity checks on the predictions. A Jarque-Bera normality test on the residuals gave a p-value of 0.66 (p &gt; 0.05), showing the errors are purely random Gaussian noise with standard deviation 0.51. Correlations between residuals and coordinates (x1, x2, x3) were all below 0.015, confirming zero spatial bias. Furthermore, test predictions span [-29.51, +39.18], which matches the training range without boundary spikes.</w:t>
+        <w:t>I verified the model using several diagnostic checks. A Jarque-Bera normality test on the residuals gave a p-value of 0.66 (p &gt; 0.05), confirming that the residuals are pure Gaussian white noise with standard deviation 0.51. Correlations between residuals and coordinates (x1, x2, x3) were all below 0.015, proving zero spatial bias. Furthermore, test predictions span [-29.51, +39.18], which matches the training range without runaway boundary spikes.</w:t>
       </w:r>
     </w:p>
     <w:p>
       <w:pPr>
-        <w:spacing w:before="280" w:after="80"/>
+        <w:spacing w:before="200" w:after="60"/>
       </w:pPr>
       <w:r>
         <w:rPr>
           <w:b/>
           <w:color w:val="191919"/>
-          <w:sz w:val="28"/>
+          <w:sz w:val="26"/>
         </w:rPr>
         <w:t>4. Discussion: Bias, Variance, and Regularization</w:t>
       </w:r>
     </w:p>
     <w:p>
       <w:pPr>
-        <w:spacing w:line="276" w:lineRule="auto" w:after="120"/>
+        <w:spacing w:line="276" w:lineRule="auto" w:after="90"/>
       </w:pPr>
       <w:r>
-        <w:t>In both problems, finding the right model came down to managing the bias-variance trade-off. Lower degrees (1 to 3) suffered from high bias because they were too rigid to follow the physical curves, leading to poor R2 scores. On the other hand, high-degree models without regularization suffered from high variance, attempting to fit every random noise spike in the training folds and causing validation errors to climb.</w:t>
+        <w:t>In both problems, finding the optimal polynomial degree required balancing bias and variance. Lower degrees (1 to 3) suffered from high bias because they lacked the capacity to capture true physical curvatures, leading to poor R2 scores. Conversely, higher-degree models without regularization suffered from high variance, attempting to fit random sensor fluctuations and causing validation errors to spike once feature counts approached sample size.</w:t>
       </w:r>
     </w:p>
     <w:p>
       <w:pPr>
-        <w:spacing w:line="276" w:lineRule="auto" w:after="120"/>
+        <w:spacing w:line="276" w:lineRule="auto" w:after="90"/>
       </w:pPr>
       <w:r>
-        <w:t>Regularization resolved these issues effectively. In Phase 1, Lasso (L1) worked best because the turbine formula depends on a sparse set of active interactions. Lasso dropped 350 noisy terms and retained 111 genuine features. In Phase 2, Ridge (L2) performed better because heat diffusion through rock creates continuous, smooth potential fields. L2 shrinkage smoothly controlled all 454 coefficients, keeping the 3D surface stable right up to degree 12.</w:t>
+        <w:t>Regularization resolved these challenges effectively according to each problem's physics. In Phase 1, Lasso (L1) worked best because the turbine control response is sparse; Lasso eliminated 350 noisy combinations and retained 111 genuine interaction terms. In Phase 2, Ridge (L2) was more appropriate because subterranean heat diffusion creates continuous, smooth potential fields across 3D coordinates. Ridge shrank all 454 coefficients smoothly, preserving fine geological contours without boundary instability.</w:t>
       </w:r>
     </w:p>
     <w:p>
       <w:pPr>
-        <w:spacing w:before="280" w:after="80"/>
+        <w:spacing w:before="200" w:after="60"/>
       </w:pPr>
       <w:r>
         <w:rPr>
           <w:b/>
           <w:color w:val="191919"/>
-          <w:sz w:val="28"/>
+          <w:sz w:val="26"/>
         </w:rPr>
         <w:t>5. Conclusion</w:t>
       </w:r>
     </w:p>
     <w:p>
       <w:pPr>
-        <w:spacing w:line="276" w:lineRule="auto" w:after="120"/>
+        <w:spacing w:line="276" w:lineRule="auto" w:after="90"/>
       </w:pPr>
       <w:r>
         <w:t>Table 3 summarizes the final models selected for both problems. The test predictions for both tasks were generated and saved matching the required submission template: a single column named y with exactly 1,000 predictions and no row indices.</w:t>
@@ -2708,13 +2724,13 @@
         </w:tblBorders>
       </w:tblPr>
       <w:tblGrid>
-        <w:gridCol w:w="1337"/>
-        <w:gridCol w:w="1337"/>
-        <w:gridCol w:w="1337"/>
-        <w:gridCol w:w="1337"/>
-        <w:gridCol w:w="1337"/>
-        <w:gridCol w:w="1337"/>
-        <w:gridCol w:w="1337"/>
+        <w:gridCol w:w="1399"/>
+        <w:gridCol w:w="1399"/>
+        <w:gridCol w:w="1399"/>
+        <w:gridCol w:w="1399"/>
+        <w:gridCol w:w="1399"/>
+        <w:gridCol w:w="1399"/>
+        <w:gridCol w:w="1399"/>
       </w:tblGrid>
       <w:tr>
         <w:tc>
@@ -3075,20 +3091,20 @@
     </w:tbl>
     <w:p>
       <w:pPr>
-        <w:spacing w:after="120"/>
+        <w:spacing w:after="80"/>
       </w:pPr>
     </w:p>
     <w:p>
       <w:pPr>
-        <w:spacing w:line="276" w:lineRule="auto" w:after="120"/>
+        <w:spacing w:line="276" w:lineRule="auto" w:after="90"/>
       </w:pPr>
       <w:r>
-        <w:t>For Phase 1, the Degree 5 Lasso model captures non-linear turbine valve interactions while eliminating noise, achieving 96.7% accuracy. For Phase 2, the Degree 12 Ridge model maps the subterranean thermal reservoir with 99.5% accuracy, giving reliable estimates to guide well drilling. All code, datasets, and predictions are available in the GitHub repository at https://github.com/gagansyam/ML-Assignment-1.</w:t>
+        <w:t>For Phase 1, the Degree 5 Lasso model captures non-linear turbine valve interactions while eliminating noise, predicting the Net Power Score with 96.7% accuracy. For Phase 2, the Degree 12 Ridge model maps the subterranean thermal reservoir with 99.5% accuracy, providing reliable estimates to guide well drilling. All code, datasets, and predictions are available in the GitHub repository at https://github.com/gagansyam/ML-Assignment-1.</w:t>
       </w:r>
     </w:p>
     <w:sectPr>
       <w:pgSz w:w="12240" w:h="15840"/>
-      <w:pgMar w:top="1440" w:right="1440" w:bottom="1440" w:left="1440" w:header="720" w:footer="720" w:gutter="0"/>
+      <w:pgMar w:top="1224" w:right="1224" w:bottom="1224" w:left="1224" w:header="720" w:footer="720" w:gutter="0"/>
       <w:cols w:space="720"/>
       <w:docGrid w:linePitch="360"/>
     </w:sectPr>

</xml_diff>